<commit_message>
feat: add documentation, update DataContext, and configure .gitignore
</commit_message>
<xml_diff>
--- a/Backend/Documents/ABC_CyberShield_Report.docx
+++ b/Backend/Documents/ABC_CyberShield_Report.docx
@@ -40,7 +40,7 @@
     <w:p>
       <w:r>
         <w:pict w14:anchorId="1C8F2BBC">
-          <v:rect id="_x0000_i1157" style="width:0;height:1.5pt" o:hralign="center" o:hrstd="t" o:hr="t" fillcolor="#a0a0a0" stroked="f"/>
+          <v:rect id="_x0000_i1025" style="width:0;height:1.5pt" o:hralign="center" o:hrstd="t" o:hr="t" fillcolor="#a0a0a0" stroked="f"/>
         </w:pict>
       </w:r>
     </w:p>
@@ -153,7 +153,7 @@
     <w:p>
       <w:r>
         <w:pict w14:anchorId="3B8D82D2">
-          <v:rect id="_x0000_i1158" style="width:0;height:1.5pt" o:hralign="center" o:hrstd="t" o:hr="t" fillcolor="#a0a0a0" stroked="f"/>
+          <v:rect id="_x0000_i1026" style="width:0;height:1.5pt" o:hralign="center" o:hrstd="t" o:hr="t" fillcolor="#a0a0a0" stroked="f"/>
         </w:pict>
       </w:r>
     </w:p>
@@ -224,7 +224,7 @@
     <w:p>
       <w:r>
         <w:pict w14:anchorId="3EE07C9E">
-          <v:rect id="_x0000_i1159" style="width:0;height:1.5pt" o:hralign="center" o:hrstd="t" o:hr="t" fillcolor="#a0a0a0" stroked="f"/>
+          <v:rect id="_x0000_i1027" style="width:0;height:1.5pt" o:hralign="center" o:hrstd="t" o:hr="t" fillcolor="#a0a0a0" stroked="f"/>
         </w:pict>
       </w:r>
     </w:p>
@@ -285,7 +285,7 @@
     <w:p>
       <w:r>
         <w:pict w14:anchorId="45199A6E">
-          <v:rect id="_x0000_i1160" style="width:0;height:1.5pt" o:hralign="center" o:hrstd="t" o:hr="t" fillcolor="#a0a0a0" stroked="f"/>
+          <v:rect id="_x0000_i1028" style="width:0;height:1.5pt" o:hralign="center" o:hrstd="t" o:hr="t" fillcolor="#a0a0a0" stroked="f"/>
         </w:pict>
       </w:r>
     </w:p>
@@ -376,7 +376,7 @@
     <w:p>
       <w:r>
         <w:pict w14:anchorId="0246506C">
-          <v:rect id="_x0000_i1161" style="width:0;height:1.5pt" o:hralign="center" o:hrstd="t" o:hr="t" fillcolor="#a0a0a0" stroked="f"/>
+          <v:rect id="_x0000_i1029" style="width:0;height:1.5pt" o:hralign="center" o:hrstd="t" o:hr="t" fillcolor="#a0a0a0" stroked="f"/>
         </w:pict>
       </w:r>
     </w:p>
@@ -388,7 +388,7 @@
     <w:p>
       <w:r>
         <w:pict w14:anchorId="5E87E645">
-          <v:rect id="_x0000_i1162" style="width:0;height:1.5pt" o:hralign="center" o:hrstd="t" o:hr="t" fillcolor="#a0a0a0" stroked="f"/>
+          <v:rect id="_x0000_i1030" style="width:0;height:1.5pt" o:hralign="center" o:hrstd="t" o:hr="t" fillcolor="#a0a0a0" stroked="f"/>
         </w:pict>
       </w:r>
     </w:p>
@@ -401,7 +401,7 @@
     <w:p>
       <w:r>
         <w:pict w14:anchorId="1E99D743">
-          <v:rect id="_x0000_i1163" style="width:0;height:1.5pt" o:hralign="center" o:hrstd="t" o:hr="t" fillcolor="#a0a0a0" stroked="f"/>
+          <v:rect id="_x0000_i1031" style="width:0;height:1.5pt" o:hralign="center" o:hrstd="t" o:hr="t" fillcolor="#a0a0a0" stroked="f"/>
         </w:pict>
       </w:r>
     </w:p>
@@ -413,7 +413,7 @@
     <w:p>
       <w:r>
         <w:pict w14:anchorId="0EE3E8EE">
-          <v:rect id="_x0000_i1164" style="width:0;height:1.5pt" o:hralign="center" o:hrstd="t" o:hr="t" fillcolor="#a0a0a0" stroked="f"/>
+          <v:rect id="_x0000_i1032" style="width:0;height:1.5pt" o:hralign="center" o:hrstd="t" o:hr="t" fillcolor="#a0a0a0" stroked="f"/>
         </w:pict>
       </w:r>
     </w:p>
@@ -425,7 +425,7 @@
     <w:p>
       <w:r>
         <w:pict w14:anchorId="586B9FCB">
-          <v:rect id="_x0000_i1165" style="width:0;height:1.5pt" o:hralign="center" o:hrstd="t" o:hr="t" fillcolor="#a0a0a0" stroked="f"/>
+          <v:rect id="_x0000_i1033" style="width:0;height:1.5pt" o:hralign="center" o:hrstd="t" o:hr="t" fillcolor="#a0a0a0" stroked="f"/>
         </w:pict>
       </w:r>
     </w:p>
@@ -475,7 +475,7 @@
     <w:p>
       <w:r>
         <w:pict w14:anchorId="33DE0477">
-          <v:rect id="_x0000_i1166" style="width:0;height:1.5pt" o:hralign="center" o:hrstd="t" o:hr="t" fillcolor="#a0a0a0" stroked="f"/>
+          <v:rect id="_x0000_i1034" style="width:0;height:1.5pt" o:hralign="center" o:hrstd="t" o:hr="t" fillcolor="#a0a0a0" stroked="f"/>
         </w:pict>
       </w:r>
     </w:p>
@@ -535,7 +535,7 @@
     <w:p>
       <w:r>
         <w:pict w14:anchorId="675E1B46">
-          <v:rect id="_x0000_i1167" style="width:0;height:1.5pt" o:hralign="center" o:hrstd="t" o:hr="t" fillcolor="#a0a0a0" stroked="f"/>
+          <v:rect id="_x0000_i1035" style="width:0;height:1.5pt" o:hralign="center" o:hrstd="t" o:hr="t" fillcolor="#a0a0a0" stroked="f"/>
         </w:pict>
       </w:r>
     </w:p>
@@ -585,7 +585,7 @@
     <w:p>
       <w:r>
         <w:pict w14:anchorId="204948AA">
-          <v:rect id="_x0000_i1168" style="width:0;height:1.5pt" o:hralign="center" o:hrstd="t" o:hr="t" fillcolor="#a0a0a0" stroked="f"/>
+          <v:rect id="_x0000_i1036" style="width:0;height:1.5pt" o:hralign="center" o:hrstd="t" o:hr="t" fillcolor="#a0a0a0" stroked="f"/>
         </w:pict>
       </w:r>
     </w:p>
@@ -670,7 +670,7 @@
     <w:p>
       <w:r>
         <w:pict w14:anchorId="36755B61">
-          <v:rect id="_x0000_i1169" style="width:0;height:1.5pt" o:hralign="center" o:hrstd="t" o:hr="t" fillcolor="#a0a0a0" stroked="f"/>
+          <v:rect id="_x0000_i1037" style="width:0;height:1.5pt" o:hralign="center" o:hrstd="t" o:hr="t" fillcolor="#a0a0a0" stroked="f"/>
         </w:pict>
       </w:r>
     </w:p>
@@ -769,7 +769,7 @@
     <w:p>
       <w:r>
         <w:pict w14:anchorId="4F3F65DD">
-          <v:rect id="_x0000_i1170" style="width:0;height:1.5pt" o:hralign="center" o:hrstd="t" o:hr="t" fillcolor="#a0a0a0" stroked="f"/>
+          <v:rect id="_x0000_i1038" style="width:0;height:1.5pt" o:hralign="center" o:hrstd="t" o:hr="t" fillcolor="#a0a0a0" stroked="f"/>
         </w:pict>
       </w:r>
     </w:p>
@@ -859,7 +859,7 @@
     <w:p>
       <w:r>
         <w:pict w14:anchorId="4E33B004">
-          <v:rect id="_x0000_i1171" style="width:0;height:1.5pt" o:hralign="center" o:hrstd="t" o:hr="t" fillcolor="#a0a0a0" stroked="f"/>
+          <v:rect id="_x0000_i1039" style="width:0;height:1.5pt" o:hralign="center" o:hrstd="t" o:hr="t" fillcolor="#a0a0a0" stroked="f"/>
         </w:pict>
       </w:r>
     </w:p>
@@ -1025,7 +1025,7 @@
     <w:p>
       <w:r>
         <w:pict w14:anchorId="2FF47666">
-          <v:rect id="_x0000_i1172" style="width:0;height:1.5pt" o:hralign="center" o:hrstd="t" o:hr="t" fillcolor="#a0a0a0" stroked="f"/>
+          <v:rect id="_x0000_i1040" style="width:0;height:1.5pt" o:hralign="center" o:hrstd="t" o:hr="t" fillcolor="#a0a0a0" stroked="f"/>
         </w:pict>
       </w:r>
     </w:p>
@@ -1157,7 +1157,7 @@
     <w:p>
       <w:r>
         <w:pict w14:anchorId="506F04F0">
-          <v:rect id="_x0000_i1173" style="width:0;height:1.5pt" o:hralign="center" o:hrstd="t" o:hr="t" fillcolor="#a0a0a0" stroked="f"/>
+          <v:rect id="_x0000_i1041" style="width:0;height:1.5pt" o:hralign="center" o:hrstd="t" o:hr="t" fillcolor="#a0a0a0" stroked="f"/>
         </w:pict>
       </w:r>
     </w:p>
@@ -1300,7 +1300,7 @@
     <w:p>
       <w:r>
         <w:pict w14:anchorId="4E1D5BE1">
-          <v:rect id="_x0000_i1174" style="width:0;height:1.5pt" o:hralign="center" o:hrstd="t" o:hr="t" fillcolor="#a0a0a0" stroked="f"/>
+          <v:rect id="_x0000_i1042" style="width:0;height:1.5pt" o:hralign="center" o:hrstd="t" o:hr="t" fillcolor="#a0a0a0" stroked="f"/>
         </w:pict>
       </w:r>
     </w:p>
@@ -1445,7 +1445,7 @@
     <w:p>
       <w:r>
         <w:pict w14:anchorId="575AA7C5">
-          <v:rect id="_x0000_i1175" style="width:0;height:1.5pt" o:hralign="center" o:hrstd="t" o:hr="t" fillcolor="#a0a0a0" stroked="f"/>
+          <v:rect id="_x0000_i1043" style="width:0;height:1.5pt" o:hralign="center" o:hrstd="t" o:hr="t" fillcolor="#a0a0a0" stroked="f"/>
         </w:pict>
       </w:r>
     </w:p>
@@ -1497,7 +1497,7 @@
     <w:p>
       <w:r>
         <w:pict w14:anchorId="4BE31306">
-          <v:rect id="_x0000_i1176" style="width:0;height:1.5pt" o:hralign="center" o:hrstd="t" o:hr="t" fillcolor="#a0a0a0" stroked="f"/>
+          <v:rect id="_x0000_i1044" style="width:0;height:1.5pt" o:hralign="center" o:hrstd="t" o:hr="t" fillcolor="#a0a0a0" stroked="f"/>
         </w:pict>
       </w:r>
     </w:p>
@@ -1659,7 +1659,7 @@
     <w:p>
       <w:r>
         <w:pict w14:anchorId="615D9A94">
-          <v:rect id="_x0000_i1177" style="width:0;height:1.5pt" o:hralign="center" o:hrstd="t" o:hr="t" fillcolor="#a0a0a0" stroked="f"/>
+          <v:rect id="_x0000_i1045" style="width:0;height:1.5pt" o:hralign="center" o:hrstd="t" o:hr="t" fillcolor="#a0a0a0" stroked="f"/>
         </w:pict>
       </w:r>
     </w:p>
@@ -2025,7 +2025,7 @@
     <w:p>
       <w:r>
         <w:pict w14:anchorId="56A757DE">
-          <v:rect id="_x0000_i1370" style="width:0;height:1.5pt" o:hralign="center" o:hrstd="t" o:hr="t" fillcolor="#a0a0a0" stroked="f"/>
+          <v:rect id="_x0000_i1046" style="width:0;height:1.5pt" o:hralign="center" o:hrstd="t" o:hr="t" fillcolor="#a0a0a0" stroked="f"/>
         </w:pict>
       </w:r>
     </w:p>
@@ -2197,7 +2197,7 @@
     <w:p>
       <w:r>
         <w:pict w14:anchorId="6CE2B789">
-          <v:rect id="_x0000_i1371" style="width:0;height:1.5pt" o:hralign="center" o:hrstd="t" o:hr="t" fillcolor="#a0a0a0" stroked="f"/>
+          <v:rect id="_x0000_i1047" style="width:0;height:1.5pt" o:hralign="center" o:hrstd="t" o:hr="t" fillcolor="#a0a0a0" stroked="f"/>
         </w:pict>
       </w:r>
     </w:p>
@@ -2311,7 +2311,7 @@
     <w:p>
       <w:r>
         <w:pict w14:anchorId="50A80572">
-          <v:rect id="_x0000_i1372" style="width:0;height:1.5pt" o:hralign="center" o:hrstd="t" o:hr="t" fillcolor="#a0a0a0" stroked="f"/>
+          <v:rect id="_x0000_i1048" style="width:0;height:1.5pt" o:hralign="center" o:hrstd="t" o:hr="t" fillcolor="#a0a0a0" stroked="f"/>
         </w:pict>
       </w:r>
     </w:p>
@@ -2418,7 +2418,7 @@
     <w:p>
       <w:r>
         <w:pict w14:anchorId="58E5B7DC">
-          <v:rect id="_x0000_i1373" style="width:0;height:1.5pt" o:hralign="center" o:hrstd="t" o:hr="t" fillcolor="#a0a0a0" stroked="f"/>
+          <v:rect id="_x0000_i1049" style="width:0;height:1.5pt" o:hralign="center" o:hrstd="t" o:hr="t" fillcolor="#a0a0a0" stroked="f"/>
         </w:pict>
       </w:r>
     </w:p>
@@ -2541,7 +2541,7 @@
       <w:r>
         <w:lastRenderedPageBreak/>
         <w:pict w14:anchorId="7FCB5DC4">
-          <v:rect id="_x0000_i1374" style="width:0;height:1.5pt" o:hralign="center" o:hrstd="t" o:hr="t" fillcolor="#a0a0a0" stroked="f"/>
+          <v:rect id="_x0000_i1050" style="width:0;height:1.5pt" o:hralign="center" o:hrstd="t" o:hr="t" fillcolor="#a0a0a0" stroked="f"/>
         </w:pict>
       </w:r>
     </w:p>
@@ -2628,7 +2628,7 @@
     <w:p>
       <w:r>
         <w:pict w14:anchorId="37D92928">
-          <v:rect id="_x0000_i1375" style="width:0;height:1.5pt" o:hralign="center" o:hrstd="t" o:hr="t" fillcolor="#a0a0a0" stroked="f"/>
+          <v:rect id="_x0000_i1051" style="width:0;height:1.5pt" o:hralign="center" o:hrstd="t" o:hr="t" fillcolor="#a0a0a0" stroked="f"/>
         </w:pict>
       </w:r>
     </w:p>
@@ -2768,7 +2768,7 @@
     <w:p>
       <w:r>
         <w:pict w14:anchorId="210CAE3D">
-          <v:rect id="_x0000_i1376" style="width:0;height:1.5pt" o:hralign="center" o:hrstd="t" o:hr="t" fillcolor="#a0a0a0" stroked="f"/>
+          <v:rect id="_x0000_i1052" style="width:0;height:1.5pt" o:hralign="center" o:hrstd="t" o:hr="t" fillcolor="#a0a0a0" stroked="f"/>
         </w:pict>
       </w:r>
     </w:p>
@@ -2945,7 +2945,7 @@
     <w:p>
       <w:r>
         <w:pict w14:anchorId="7E85114E">
-          <v:rect id="_x0000_i1377" style="width:0;height:1.5pt" o:hralign="center" o:hrstd="t" o:hr="t" fillcolor="#a0a0a0" stroked="f"/>
+          <v:rect id="_x0000_i1053" style="width:0;height:1.5pt" o:hralign="center" o:hrstd="t" o:hr="t" fillcolor="#a0a0a0" stroked="f"/>
         </w:pict>
       </w:r>
     </w:p>
@@ -3044,7 +3044,7 @@
     <w:p>
       <w:r>
         <w:pict w14:anchorId="51F5D18D">
-          <v:rect id="_x0000_i1378" style="width:0;height:1.5pt" o:hralign="center" o:hrstd="t" o:hr="t" fillcolor="#a0a0a0" stroked="f"/>
+          <v:rect id="_x0000_i1054" style="width:0;height:1.5pt" o:hralign="center" o:hrstd="t" o:hr="t" fillcolor="#a0a0a0" stroked="f"/>
         </w:pict>
       </w:r>
     </w:p>
@@ -3082,7 +3082,7 @@
     <w:p>
       <w:r>
         <w:pict w14:anchorId="5E74DD92">
-          <v:rect id="_x0000_i1379" style="width:0;height:1.5pt" o:hralign="center" o:hrstd="t" o:hr="t" fillcolor="#a0a0a0" stroked="f"/>
+          <v:rect id="_x0000_i1055" style="width:0;height:1.5pt" o:hralign="center" o:hrstd="t" o:hr="t" fillcolor="#a0a0a0" stroked="f"/>
         </w:pict>
       </w:r>
     </w:p>
@@ -3276,7 +3276,7 @@
     <w:p>
       <w:r>
         <w:pict w14:anchorId="44651197">
-          <v:rect id="_x0000_i1380" style="width:0;height:1.5pt" o:hralign="center" o:hrstd="t" o:hr="t" fillcolor="#a0a0a0" stroked="f"/>
+          <v:rect id="_x0000_i1056" style="width:0;height:1.5pt" o:hralign="center" o:hrstd="t" o:hr="t" fillcolor="#a0a0a0" stroked="f"/>
         </w:pict>
       </w:r>
     </w:p>
@@ -3460,7 +3460,7 @@
     <w:p>
       <w:r>
         <w:pict w14:anchorId="7460A8BE">
-          <v:rect id="_x0000_i1381" style="width:0;height:1.5pt" o:hralign="center" o:hrstd="t" o:hr="t" fillcolor="#a0a0a0" stroked="f"/>
+          <v:rect id="_x0000_i1057" style="width:0;height:1.5pt" o:hralign="center" o:hrstd="t" o:hr="t" fillcolor="#a0a0a0" stroked="f"/>
         </w:pict>
       </w:r>
     </w:p>
@@ -3567,7 +3567,7 @@
     <w:p>
       <w:r>
         <w:pict w14:anchorId="3B366787">
-          <v:rect id="_x0000_i1382" style="width:0;height:1.5pt" o:hralign="center" o:hrstd="t" o:hr="t" fillcolor="#a0a0a0" stroked="f"/>
+          <v:rect id="_x0000_i1058" style="width:0;height:1.5pt" o:hralign="center" o:hrstd="t" o:hr="t" fillcolor="#a0a0a0" stroked="f"/>
         </w:pict>
       </w:r>
     </w:p>
@@ -3619,7 +3619,7 @@
     <w:p>
       <w:r>
         <w:pict w14:anchorId="312E6C1A">
-          <v:rect id="_x0000_i1383" style="width:0;height:1.5pt" o:hralign="center" o:hrstd="t" o:hr="t" fillcolor="#a0a0a0" stroked="f"/>
+          <v:rect id="_x0000_i1059" style="width:0;height:1.5pt" o:hralign="center" o:hrstd="t" o:hr="t" fillcolor="#a0a0a0" stroked="f"/>
         </w:pict>
       </w:r>
     </w:p>
@@ -3656,7 +3656,7 @@
     <w:p>
       <w:r>
         <w:pict w14:anchorId="5CF5F4EA">
-          <v:rect id="_x0000_i1384" style="width:0;height:1.5pt" o:hralign="center" o:hrstd="t" o:hr="t" fillcolor="#a0a0a0" stroked="f"/>
+          <v:rect id="_x0000_i1060" style="width:0;height:1.5pt" o:hralign="center" o:hrstd="t" o:hr="t" fillcolor="#a0a0a0" stroked="f"/>
         </w:pict>
       </w:r>
     </w:p>
@@ -3693,7 +3693,7 @@
     <w:p>
       <w:r>
         <w:pict w14:anchorId="62C19C2F">
-          <v:rect id="_x0000_i1385" style="width:0;height:1.5pt" o:hralign="center" o:hrstd="t" o:hr="t" fillcolor="#a0a0a0" stroked="f"/>
+          <v:rect id="_x0000_i1061" style="width:0;height:1.5pt" o:hralign="center" o:hrstd="t" o:hr="t" fillcolor="#a0a0a0" stroked="f"/>
         </w:pict>
       </w:r>
     </w:p>
@@ -3731,7 +3731,7 @@
     <w:p>
       <w:r>
         <w:pict w14:anchorId="3891957C">
-          <v:rect id="_x0000_i1386" style="width:0;height:1.5pt" o:hralign="center" o:hrstd="t" o:hr="t" fillcolor="#a0a0a0" stroked="f"/>
+          <v:rect id="_x0000_i1062" style="width:0;height:1.5pt" o:hralign="center" o:hrstd="t" o:hr="t" fillcolor="#a0a0a0" stroked="f"/>
         </w:pict>
       </w:r>
     </w:p>
@@ -3773,7 +3773,7 @@
     <w:p>
       <w:r>
         <w:pict w14:anchorId="44208ACA">
-          <v:rect id="_x0000_i1387" style="width:0;height:1.5pt" o:hralign="center" o:hrstd="t" o:hr="t" fillcolor="#a0a0a0" stroked="f"/>
+          <v:rect id="_x0000_i1063" style="width:0;height:1.5pt" o:hralign="center" o:hrstd="t" o:hr="t" fillcolor="#a0a0a0" stroked="f"/>
         </w:pict>
       </w:r>
     </w:p>
@@ -3815,7 +3815,7 @@
     <w:p>
       <w:r>
         <w:pict w14:anchorId="2F7951EF">
-          <v:rect id="_x0000_i1388" style="width:0;height:1.5pt" o:hralign="center" o:hrstd="t" o:hr="t" fillcolor="#a0a0a0" stroked="f"/>
+          <v:rect id="_x0000_i1064" style="width:0;height:1.5pt" o:hralign="center" o:hrstd="t" o:hr="t" fillcolor="#a0a0a0" stroked="f"/>
         </w:pict>
       </w:r>
     </w:p>
@@ -3926,7 +3926,7 @@
     <w:p>
       <w:r>
         <w:pict w14:anchorId="5C48FC8A">
-          <v:rect id="_x0000_i1389" style="width:0;height:1.5pt" o:hralign="center" o:hrstd="t" o:hr="t" fillcolor="#a0a0a0" stroked="f"/>
+          <v:rect id="_x0000_i1065" style="width:0;height:1.5pt" o:hralign="center" o:hrstd="t" o:hr="t" fillcolor="#a0a0a0" stroked="f"/>
         </w:pict>
       </w:r>
     </w:p>
@@ -3992,7 +3992,7 @@
     <w:p>
       <w:r>
         <w:pict w14:anchorId="770D153E">
-          <v:rect id="_x0000_i1390" style="width:0;height:1.5pt" o:hralign="center" o:hrstd="t" o:hr="t" fillcolor="#a0a0a0" stroked="f"/>
+          <v:rect id="_x0000_i1066" style="width:0;height:1.5pt" o:hralign="center" o:hrstd="t" o:hr="t" fillcolor="#a0a0a0" stroked="f"/>
         </w:pict>
       </w:r>
     </w:p>
@@ -4048,7 +4048,7 @@
       <w:r>
         <w:lastRenderedPageBreak/>
         <w:pict w14:anchorId="4BF4E6EE">
-          <v:rect id="_x0000_i1391" style="width:0;height:1.5pt" o:hralign="center" o:hrstd="t" o:hr="t" fillcolor="#a0a0a0" stroked="f"/>
+          <v:rect id="_x0000_i1067" style="width:0;height:1.5pt" o:hralign="center" o:hrstd="t" o:hr="t" fillcolor="#a0a0a0" stroked="f"/>
         </w:pict>
       </w:r>
     </w:p>
@@ -4103,7 +4103,7 @@
     <w:p>
       <w:r>
         <w:pict w14:anchorId="0D4C1899">
-          <v:rect id="_x0000_i1392" style="width:0;height:1.5pt" o:hralign="center" o:hrstd="t" o:hr="t" fillcolor="#a0a0a0" stroked="f"/>
+          <v:rect id="_x0000_i1068" style="width:0;height:1.5pt" o:hralign="center" o:hrstd="t" o:hr="t" fillcolor="#a0a0a0" stroked="f"/>
         </w:pict>
       </w:r>
     </w:p>
@@ -4158,7 +4158,7 @@
     <w:p>
       <w:r>
         <w:pict w14:anchorId="3B585AC8">
-          <v:rect id="_x0000_i1393" style="width:0;height:1.5pt" o:hralign="center" o:hrstd="t" o:hr="t" fillcolor="#a0a0a0" stroked="f"/>
+          <v:rect id="_x0000_i1069" style="width:0;height:1.5pt" o:hralign="center" o:hrstd="t" o:hr="t" fillcolor="#a0a0a0" stroked="f"/>
         </w:pict>
       </w:r>
     </w:p>
@@ -4224,7 +4224,7 @@
     <w:p>
       <w:r>
         <w:pict w14:anchorId="479F8325">
-          <v:rect id="_x0000_i1394" style="width:0;height:1.5pt" o:hralign="center" o:hrstd="t" o:hr="t" fillcolor="#a0a0a0" stroked="f"/>
+          <v:rect id="_x0000_i1070" style="width:0;height:1.5pt" o:hralign="center" o:hrstd="t" o:hr="t" fillcolor="#a0a0a0" stroked="f"/>
         </w:pict>
       </w:r>
     </w:p>
@@ -4279,7 +4279,7 @@
     <w:p>
       <w:r>
         <w:pict w14:anchorId="4D771023">
-          <v:rect id="_x0000_i1395" style="width:0;height:1.5pt" o:hralign="center" o:hrstd="t" o:hr="t" fillcolor="#a0a0a0" stroked="f"/>
+          <v:rect id="_x0000_i1071" style="width:0;height:1.5pt" o:hralign="center" o:hrstd="t" o:hr="t" fillcolor="#a0a0a0" stroked="f"/>
         </w:pict>
       </w:r>
     </w:p>
@@ -4334,7 +4334,7 @@
     <w:p>
       <w:r>
         <w:pict w14:anchorId="6BB2E58E">
-          <v:rect id="_x0000_i1396" style="width:0;height:1.5pt" o:hralign="center" o:hrstd="t" o:hr="t" fillcolor="#a0a0a0" stroked="f"/>
+          <v:rect id="_x0000_i1072" style="width:0;height:1.5pt" o:hralign="center" o:hrstd="t" o:hr="t" fillcolor="#a0a0a0" stroked="f"/>
         </w:pict>
       </w:r>
     </w:p>
@@ -4542,7 +4542,7 @@
     <w:p>
       <w:r>
         <w:pict w14:anchorId="491D666E">
-          <v:rect id="_x0000_i1397" style="width:0;height:1.5pt" o:hralign="center" o:hrstd="t" o:hr="t" fillcolor="#a0a0a0" stroked="f"/>
+          <v:rect id="_x0000_i1073" style="width:0;height:1.5pt" o:hralign="center" o:hrstd="t" o:hr="t" fillcolor="#a0a0a0" stroked="f"/>
         </w:pict>
       </w:r>
     </w:p>
@@ -4589,7 +4589,7 @@
     <w:p>
       <w:r>
         <w:pict w14:anchorId="1868D1BC">
-          <v:rect id="_x0000_i1612" style="width:0;height:1.5pt" o:hralign="center" o:hrstd="t" o:hr="t" fillcolor="#a0a0a0" stroked="f"/>
+          <v:rect id="_x0000_i1074" style="width:0;height:1.5pt" o:hralign="center" o:hrstd="t" o:hr="t" fillcolor="#a0a0a0" stroked="f"/>
         </w:pict>
       </w:r>
     </w:p>
@@ -4792,7 +4792,7 @@
     <w:p>
       <w:r>
         <w:pict w14:anchorId="0842CC7A">
-          <v:rect id="_x0000_i1613" style="width:0;height:1.5pt" o:hralign="center" o:hrstd="t" o:hr="t" fillcolor="#a0a0a0" stroked="f"/>
+          <v:rect id="_x0000_i1075" style="width:0;height:1.5pt" o:hralign="center" o:hrstd="t" o:hr="t" fillcolor="#a0a0a0" stroked="f"/>
         </w:pict>
       </w:r>
     </w:p>
@@ -5065,7 +5065,7 @@
     <w:p>
       <w:r>
         <w:pict w14:anchorId="05AB1A1F">
-          <v:rect id="_x0000_i1614" style="width:0;height:1.5pt" o:hralign="center" o:hrstd="t" o:hr="t" fillcolor="#a0a0a0" stroked="f"/>
+          <v:rect id="_x0000_i1076" style="width:0;height:1.5pt" o:hralign="center" o:hrstd="t" o:hr="t" fillcolor="#a0a0a0" stroked="f"/>
         </w:pict>
       </w:r>
     </w:p>
@@ -5268,7 +5268,7 @@
     <w:p>
       <w:r>
         <w:pict w14:anchorId="1015DAC6">
-          <v:rect id="_x0000_i1615" style="width:0;height:1.5pt" o:hralign="center" o:hrstd="t" o:hr="t" fillcolor="#a0a0a0" stroked="f"/>
+          <v:rect id="_x0000_i1077" style="width:0;height:1.5pt" o:hralign="center" o:hrstd="t" o:hr="t" fillcolor="#a0a0a0" stroked="f"/>
         </w:pict>
       </w:r>
     </w:p>
@@ -5327,7 +5327,7 @@
     <w:p>
       <w:r>
         <w:pict w14:anchorId="3176AAA8">
-          <v:rect id="_x0000_i1616" style="width:0;height:1.5pt" o:hralign="center" o:hrstd="t" o:hr="t" fillcolor="#a0a0a0" stroked="f"/>
+          <v:rect id="_x0000_i1078" style="width:0;height:1.5pt" o:hralign="center" o:hrstd="t" o:hr="t" fillcolor="#a0a0a0" stroked="f"/>
         </w:pict>
       </w:r>
     </w:p>
@@ -5382,7 +5382,7 @@
     <w:p>
       <w:r>
         <w:pict w14:anchorId="307DC8DF">
-          <v:rect id="_x0000_i1617" style="width:0;height:1.5pt" o:hralign="center" o:hrstd="t" o:hr="t" fillcolor="#a0a0a0" stroked="f"/>
+          <v:rect id="_x0000_i1079" style="width:0;height:1.5pt" o:hralign="center" o:hrstd="t" o:hr="t" fillcolor="#a0a0a0" stroked="f"/>
         </w:pict>
       </w:r>
     </w:p>
@@ -5429,7 +5429,7 @@
     <w:p>
       <w:r>
         <w:pict w14:anchorId="648FE4AF">
-          <v:rect id="_x0000_i1618" style="width:0;height:1.5pt" o:hralign="center" o:hrstd="t" o:hr="t" fillcolor="#a0a0a0" stroked="f"/>
+          <v:rect id="_x0000_i1080" style="width:0;height:1.5pt" o:hralign="center" o:hrstd="t" o:hr="t" fillcolor="#a0a0a0" stroked="f"/>
         </w:pict>
       </w:r>
     </w:p>
@@ -5476,7 +5476,7 @@
     <w:p>
       <w:r>
         <w:pict w14:anchorId="7F44E6F6">
-          <v:rect id="_x0000_i1619" style="width:0;height:1.5pt" o:hralign="center" o:hrstd="t" o:hr="t" fillcolor="#a0a0a0" stroked="f"/>
+          <v:rect id="_x0000_i1081" style="width:0;height:1.5pt" o:hralign="center" o:hrstd="t" o:hr="t" fillcolor="#a0a0a0" stroked="f"/>
         </w:pict>
       </w:r>
     </w:p>
@@ -5523,7 +5523,7 @@
     <w:p>
       <w:r>
         <w:pict w14:anchorId="115D5FF5">
-          <v:rect id="_x0000_i1620" style="width:0;height:1.5pt" o:hralign="center" o:hrstd="t" o:hr="t" fillcolor="#a0a0a0" stroked="f"/>
+          <v:rect id="_x0000_i1082" style="width:0;height:1.5pt" o:hralign="center" o:hrstd="t" o:hr="t" fillcolor="#a0a0a0" stroked="f"/>
         </w:pict>
       </w:r>
     </w:p>
@@ -5570,7 +5570,7 @@
     <w:p>
       <w:r>
         <w:pict w14:anchorId="463705C2">
-          <v:rect id="_x0000_i1621" style="width:0;height:1.5pt" o:hralign="center" o:hrstd="t" o:hr="t" fillcolor="#a0a0a0" stroked="f"/>
+          <v:rect id="_x0000_i1083" style="width:0;height:1.5pt" o:hralign="center" o:hrstd="t" o:hr="t" fillcolor="#a0a0a0" stroked="f"/>
         </w:pict>
       </w:r>
     </w:p>
@@ -5618,7 +5618,7 @@
     <w:p>
       <w:r>
         <w:pict w14:anchorId="47E4AF74">
-          <v:rect id="_x0000_i1622" style="width:0;height:1.5pt" o:hralign="center" o:hrstd="t" o:hr="t" fillcolor="#a0a0a0" stroked="f"/>
+          <v:rect id="_x0000_i1084" style="width:0;height:1.5pt" o:hralign="center" o:hrstd="t" o:hr="t" fillcolor="#a0a0a0" stroked="f"/>
         </w:pict>
       </w:r>
     </w:p>
@@ -5720,7 +5720,7 @@
     <w:p>
       <w:r>
         <w:pict w14:anchorId="2B2BD606">
-          <v:rect id="_x0000_i1623" style="width:0;height:1.5pt" o:hralign="center" o:hrstd="t" o:hr="t" fillcolor="#a0a0a0" stroked="f"/>
+          <v:rect id="_x0000_i1085" style="width:0;height:1.5pt" o:hralign="center" o:hrstd="t" o:hr="t" fillcolor="#a0a0a0" stroked="f"/>
         </w:pict>
       </w:r>
     </w:p>
@@ -5873,7 +5873,7 @@
     <w:p>
       <w:r>
         <w:pict w14:anchorId="4BBE78B3">
-          <v:rect id="_x0000_i1624" style="width:0;height:1.5pt" o:hralign="center" o:hrstd="t" o:hr="t" fillcolor="#a0a0a0" stroked="f"/>
+          <v:rect id="_x0000_i1086" style="width:0;height:1.5pt" o:hralign="center" o:hrstd="t" o:hr="t" fillcolor="#a0a0a0" stroked="f"/>
         </w:pict>
       </w:r>
     </w:p>
@@ -5953,7 +5953,7 @@
     <w:p>
       <w:r>
         <w:pict w14:anchorId="652940AB">
-          <v:rect id="_x0000_i1625" style="width:0;height:1.5pt" o:hralign="center" o:hrstd="t" o:hr="t" fillcolor="#a0a0a0" stroked="f"/>
+          <v:rect id="_x0000_i1087" style="width:0;height:1.5pt" o:hralign="center" o:hrstd="t" o:hr="t" fillcolor="#a0a0a0" stroked="f"/>
         </w:pict>
       </w:r>
     </w:p>
@@ -6007,7 +6007,7 @@
     <w:p>
       <w:r>
         <w:pict w14:anchorId="7AA2D18F">
-          <v:rect id="_x0000_i1626" style="width:0;height:1.5pt" o:hralign="center" o:hrstd="t" o:hr="t" fillcolor="#a0a0a0" stroked="f"/>
+          <v:rect id="_x0000_i1088" style="width:0;height:1.5pt" o:hralign="center" o:hrstd="t" o:hr="t" fillcolor="#a0a0a0" stroked="f"/>
         </w:pict>
       </w:r>
     </w:p>
@@ -6050,7 +6050,7 @@
     <w:p>
       <w:r>
         <w:pict w14:anchorId="534E5B4D">
-          <v:rect id="_x0000_i1627" style="width:0;height:1.5pt" o:hralign="center" o:hrstd="t" o:hr="t" fillcolor="#a0a0a0" stroked="f"/>
+          <v:rect id="_x0000_i1089" style="width:0;height:1.5pt" o:hralign="center" o:hrstd="t" o:hr="t" fillcolor="#a0a0a0" stroked="f"/>
         </w:pict>
       </w:r>
     </w:p>
@@ -6105,7 +6105,7 @@
     <w:p>
       <w:r>
         <w:pict w14:anchorId="001178A9">
-          <v:rect id="_x0000_i1628" style="width:0;height:1.5pt" o:hralign="center" o:hrstd="t" o:hr="t" fillcolor="#a0a0a0" stroked="f"/>
+          <v:rect id="_x0000_i1090" style="width:0;height:1.5pt" o:hralign="center" o:hrstd="t" o:hr="t" fillcolor="#a0a0a0" stroked="f"/>
         </w:pict>
       </w:r>
     </w:p>
@@ -6161,7 +6161,7 @@
     <w:p>
       <w:r>
         <w:pict w14:anchorId="394E9D26">
-          <v:rect id="_x0000_i1629" style="width:0;height:1.5pt" o:hralign="center" o:hrstd="t" o:hr="t" fillcolor="#a0a0a0" stroked="f"/>
+          <v:rect id="_x0000_i1091" style="width:0;height:1.5pt" o:hralign="center" o:hrstd="t" o:hr="t" fillcolor="#a0a0a0" stroked="f"/>
         </w:pict>
       </w:r>
     </w:p>
@@ -6278,7 +6278,7 @@
     <w:p>
       <w:r>
         <w:pict w14:anchorId="17EF85AA">
-          <v:rect id="_x0000_i1630" style="width:0;height:1.5pt" o:hralign="center" o:hrstd="t" o:hr="t" fillcolor="#a0a0a0" stroked="f"/>
+          <v:rect id="_x0000_i1092" style="width:0;height:1.5pt" o:hralign="center" o:hrstd="t" o:hr="t" fillcolor="#a0a0a0" stroked="f"/>
         </w:pict>
       </w:r>
     </w:p>
@@ -6340,7 +6340,7 @@
     <w:p>
       <w:r>
         <w:pict w14:anchorId="5AE7771D">
-          <v:rect id="_x0000_i1631" style="width:0;height:1.5pt" o:hralign="center" o:hrstd="t" o:hr="t" fillcolor="#a0a0a0" stroked="f"/>
+          <v:rect id="_x0000_i1093" style="width:0;height:1.5pt" o:hralign="center" o:hrstd="t" o:hr="t" fillcolor="#a0a0a0" stroked="f"/>
         </w:pict>
       </w:r>
     </w:p>
@@ -6403,7 +6403,7 @@
       <w:r>
         <w:lastRenderedPageBreak/>
         <w:pict w14:anchorId="7CD181C0">
-          <v:rect id="_x0000_i1632" style="width:0;height:1.5pt" o:hralign="center" o:hrstd="t" o:hr="t" fillcolor="#a0a0a0" stroked="f"/>
+          <v:rect id="_x0000_i1094" style="width:0;height:1.5pt" o:hralign="center" o:hrstd="t" o:hr="t" fillcolor="#a0a0a0" stroked="f"/>
         </w:pict>
       </w:r>
     </w:p>
@@ -6467,7 +6467,7 @@
     <w:p>
       <w:r>
         <w:pict w14:anchorId="0C6BAA60">
-          <v:rect id="_x0000_i1633" style="width:0;height:1.5pt" o:hralign="center" o:hrstd="t" o:hr="t" fillcolor="#a0a0a0" stroked="f"/>
+          <v:rect id="_x0000_i1095" style="width:0;height:1.5pt" o:hralign="center" o:hrstd="t" o:hr="t" fillcolor="#a0a0a0" stroked="f"/>
         </w:pict>
       </w:r>
     </w:p>
@@ -6553,7 +6553,7 @@
     <w:p>
       <w:r>
         <w:pict w14:anchorId="1973CFA9">
-          <v:rect id="_x0000_i1634" style="width:0;height:1.5pt" o:hralign="center" o:hrstd="t" o:hr="t" fillcolor="#a0a0a0" stroked="f"/>
+          <v:rect id="_x0000_i1096" style="width:0;height:1.5pt" o:hralign="center" o:hrstd="t" o:hr="t" fillcolor="#a0a0a0" stroked="f"/>
         </w:pict>
       </w:r>
     </w:p>
@@ -6677,7 +6677,7 @@
     <w:p>
       <w:r>
         <w:pict w14:anchorId="0AF2555F">
-          <v:rect id="_x0000_i1635" style="width:0;height:1.5pt" o:hralign="center" o:hrstd="t" o:hr="t" fillcolor="#a0a0a0" stroked="f"/>
+          <v:rect id="_x0000_i1097" style="width:0;height:1.5pt" o:hralign="center" o:hrstd="t" o:hr="t" fillcolor="#a0a0a0" stroked="f"/>
         </w:pict>
       </w:r>
     </w:p>
@@ -6765,7 +6765,7 @@
     <w:p>
       <w:r>
         <w:pict w14:anchorId="0DC1E239">
-          <v:rect id="_x0000_i1636" style="width:0;height:1.5pt" o:hralign="center" o:hrstd="t" o:hr="t" fillcolor="#a0a0a0" stroked="f"/>
+          <v:rect id="_x0000_i1098" style="width:0;height:1.5pt" o:hralign="center" o:hrstd="t" o:hr="t" fillcolor="#a0a0a0" stroked="f"/>
         </w:pict>
       </w:r>
     </w:p>
@@ -6865,7 +6865,7 @@
     <w:p>
       <w:r>
         <w:pict w14:anchorId="62106DD6">
-          <v:rect id="_x0000_i1637" style="width:0;height:1.5pt" o:hralign="center" o:hrstd="t" o:hr="t" fillcolor="#a0a0a0" stroked="f"/>
+          <v:rect id="_x0000_i1099" style="width:0;height:1.5pt" o:hralign="center" o:hrstd="t" o:hr="t" fillcolor="#a0a0a0" stroked="f"/>
         </w:pict>
       </w:r>
     </w:p>
@@ -6952,7 +6952,7 @@
     <w:p>
       <w:r>
         <w:pict w14:anchorId="2B528F5F">
-          <v:rect id="_x0000_i1638" style="width:0;height:1.5pt" o:hralign="center" o:hrstd="t" o:hr="t" fillcolor="#a0a0a0" stroked="f"/>
+          <v:rect id="_x0000_i1100" style="width:0;height:1.5pt" o:hralign="center" o:hrstd="t" o:hr="t" fillcolor="#a0a0a0" stroked="f"/>
         </w:pict>
       </w:r>
     </w:p>
@@ -7031,7 +7031,7 @@
       <w:r>
         <w:lastRenderedPageBreak/>
         <w:pict w14:anchorId="1953072E">
-          <v:rect id="_x0000_i1639" style="width:0;height:1.5pt" o:hralign="center" o:hrstd="t" o:hr="t" fillcolor="#a0a0a0" stroked="f"/>
+          <v:rect id="_x0000_i1101" style="width:0;height:1.5pt" o:hralign="center" o:hrstd="t" o:hr="t" fillcolor="#a0a0a0" stroked="f"/>
         </w:pict>
       </w:r>
     </w:p>
@@ -7123,7 +7123,7 @@
     <w:p>
       <w:r>
         <w:pict w14:anchorId="2147371F">
-          <v:rect id="_x0000_i1676" style="width:0;height:1.5pt" o:hralign="center" o:hrstd="t" o:hr="t" fillcolor="#a0a0a0" stroked="f"/>
+          <v:rect id="_x0000_i1102" style="width:0;height:1.5pt" o:hralign="center" o:hrstd="t" o:hr="t" fillcolor="#a0a0a0" stroked="f"/>
         </w:pict>
       </w:r>
     </w:p>
@@ -7419,7 +7419,7 @@
     <w:p>
       <w:r>
         <w:pict w14:anchorId="441A57B5">
-          <v:rect id="_x0000_i1641" style="width:0;height:1.5pt" o:hralign="center" o:hrstd="t" o:hr="t" fillcolor="#a0a0a0" stroked="f"/>
+          <v:rect id="_x0000_i1103" style="width:0;height:1.5pt" o:hralign="center" o:hrstd="t" o:hr="t" fillcolor="#a0a0a0" stroked="f"/>
         </w:pict>
       </w:r>
     </w:p>
@@ -7798,7 +7798,7 @@
     <w:p>
       <w:r>
         <w:pict w14:anchorId="41A3A47A">
-          <v:rect id="_x0000_i1642" style="width:0;height:1.5pt" o:hralign="center" o:hrstd="t" o:hr="t" fillcolor="#a0a0a0" stroked="f"/>
+          <v:rect id="_x0000_i1104" style="width:0;height:1.5pt" o:hralign="center" o:hrstd="t" o:hr="t" fillcolor="#a0a0a0" stroked="f"/>
         </w:pict>
       </w:r>
     </w:p>
@@ -7845,7 +7845,7 @@
     <w:p>
       <w:r>
         <w:pict w14:anchorId="510FAD46">
-          <v:rect id="_x0000_i1881" style="width:0;height:1.5pt" o:hralign="center" o:hrstd="t" o:hr="t" fillcolor="#a0a0a0" stroked="f"/>
+          <v:rect id="_x0000_i1105" style="width:0;height:1.5pt" o:hralign="center" o:hrstd="t" o:hr="t" fillcolor="#a0a0a0" stroked="f"/>
         </w:pict>
       </w:r>
     </w:p>
@@ -8035,7 +8035,7 @@
     <w:p>
       <w:r>
         <w:pict w14:anchorId="61773690">
-          <v:rect id="_x0000_i1882" style="width:0;height:1.5pt" o:hralign="center" o:hrstd="t" o:hr="t" fillcolor="#a0a0a0" stroked="f"/>
+          <v:rect id="_x0000_i1106" style="width:0;height:1.5pt" o:hralign="center" o:hrstd="t" o:hr="t" fillcolor="#a0a0a0" stroked="f"/>
         </w:pict>
       </w:r>
     </w:p>
@@ -8235,7 +8235,7 @@
     <w:p>
       <w:r>
         <w:pict w14:anchorId="35750DE0">
-          <v:rect id="_x0000_i1883" style="width:0;height:1.5pt" o:hralign="center" o:hrstd="t" o:hr="t" fillcolor="#a0a0a0" stroked="f"/>
+          <v:rect id="_x0000_i1107" style="width:0;height:1.5pt" o:hralign="center" o:hrstd="t" o:hr="t" fillcolor="#a0a0a0" stroked="f"/>
         </w:pict>
       </w:r>
     </w:p>
@@ -8384,7 +8384,7 @@
     <w:p>
       <w:r>
         <w:pict w14:anchorId="66A222DD">
-          <v:rect id="_x0000_i1884" style="width:0;height:1.5pt" o:hralign="center" o:hrstd="t" o:hr="t" fillcolor="#a0a0a0" stroked="f"/>
+          <v:rect id="_x0000_i1108" style="width:0;height:1.5pt" o:hralign="center" o:hrstd="t" o:hr="t" fillcolor="#a0a0a0" stroked="f"/>
         </w:pict>
       </w:r>
     </w:p>
@@ -8406,7 +8406,7 @@
     <w:p>
       <w:r>
         <w:pict w14:anchorId="752065FA">
-          <v:rect id="_x0000_i1885" style="width:0;height:1.5pt" o:hralign="center" o:hrstd="t" o:hr="t" fillcolor="#a0a0a0" stroked="f"/>
+          <v:rect id="_x0000_i1109" style="width:0;height:1.5pt" o:hralign="center" o:hrstd="t" o:hr="t" fillcolor="#a0a0a0" stroked="f"/>
         </w:pict>
       </w:r>
     </w:p>
@@ -8566,7 +8566,7 @@
     <w:p>
       <w:r>
         <w:pict w14:anchorId="76F52506">
-          <v:rect id="_x0000_i1886" style="width:0;height:1.5pt" o:hralign="center" o:hrstd="t" o:hr="t" fillcolor="#a0a0a0" stroked="f"/>
+          <v:rect id="_x0000_i1110" style="width:0;height:1.5pt" o:hralign="center" o:hrstd="t" o:hr="t" fillcolor="#a0a0a0" stroked="f"/>
         </w:pict>
       </w:r>
     </w:p>
@@ -8735,7 +8735,7 @@
     <w:p>
       <w:r>
         <w:pict w14:anchorId="359A451A">
-          <v:rect id="_x0000_i1887" style="width:0;height:1.5pt" o:hralign="center" o:hrstd="t" o:hr="t" fillcolor="#a0a0a0" stroked="f"/>
+          <v:rect id="_x0000_i1111" style="width:0;height:1.5pt" o:hralign="center" o:hrstd="t" o:hr="t" fillcolor="#a0a0a0" stroked="f"/>
         </w:pict>
       </w:r>
     </w:p>
@@ -8884,7 +8884,7 @@
     <w:p>
       <w:r>
         <w:pict w14:anchorId="7A59BBE7">
-          <v:rect id="_x0000_i1888" style="width:0;height:1.5pt" o:hralign="center" o:hrstd="t" o:hr="t" fillcolor="#a0a0a0" stroked="f"/>
+          <v:rect id="_x0000_i1112" style="width:0;height:1.5pt" o:hralign="center" o:hrstd="t" o:hr="t" fillcolor="#a0a0a0" stroked="f"/>
         </w:pict>
       </w:r>
     </w:p>
@@ -9069,7 +9069,7 @@
     <w:p>
       <w:r>
         <w:pict w14:anchorId="5F8A755E">
-          <v:rect id="_x0000_i1889" style="width:0;height:1.5pt" o:hralign="center" o:hrstd="t" o:hr="t" fillcolor="#a0a0a0" stroked="f"/>
+          <v:rect id="_x0000_i1113" style="width:0;height:1.5pt" o:hralign="center" o:hrstd="t" o:hr="t" fillcolor="#a0a0a0" stroked="f"/>
         </w:pict>
       </w:r>
     </w:p>
@@ -9218,7 +9218,7 @@
     <w:p>
       <w:r>
         <w:pict w14:anchorId="5DC57914">
-          <v:rect id="_x0000_i1890" style="width:0;height:1.5pt" o:hralign="center" o:hrstd="t" o:hr="t" fillcolor="#a0a0a0" stroked="f"/>
+          <v:rect id="_x0000_i1114" style="width:0;height:1.5pt" o:hralign="center" o:hrstd="t" o:hr="t" fillcolor="#a0a0a0" stroked="f"/>
         </w:pict>
       </w:r>
     </w:p>
@@ -9388,7 +9388,7 @@
     <w:p>
       <w:r>
         <w:pict w14:anchorId="7BC2DD9D">
-          <v:rect id="_x0000_i1891" style="width:0;height:1.5pt" o:hralign="center" o:hrstd="t" o:hr="t" fillcolor="#a0a0a0" stroked="f"/>
+          <v:rect id="_x0000_i1115" style="width:0;height:1.5pt" o:hralign="center" o:hrstd="t" o:hr="t" fillcolor="#a0a0a0" stroked="f"/>
         </w:pict>
       </w:r>
     </w:p>
@@ -9489,7 +9489,7 @@
     <w:p>
       <w:r>
         <w:pict w14:anchorId="7DBCB8B5">
-          <v:rect id="_x0000_i1892" style="width:0;height:1.5pt" o:hralign="center" o:hrstd="t" o:hr="t" fillcolor="#a0a0a0" stroked="f"/>
+          <v:rect id="_x0000_i1116" style="width:0;height:1.5pt" o:hralign="center" o:hrstd="t" o:hr="t" fillcolor="#a0a0a0" stroked="f"/>
         </w:pict>
       </w:r>
     </w:p>
@@ -9579,7 +9579,7 @@
     <w:p>
       <w:r>
         <w:pict w14:anchorId="4C06EE84">
-          <v:rect id="_x0000_i1893" style="width:0;height:1.5pt" o:hralign="center" o:hrstd="t" o:hr="t" fillcolor="#a0a0a0" stroked="f"/>
+          <v:rect id="_x0000_i1117" style="width:0;height:1.5pt" o:hralign="center" o:hrstd="t" o:hr="t" fillcolor="#a0a0a0" stroked="f"/>
         </w:pict>
       </w:r>
     </w:p>
@@ -9681,7 +9681,7 @@
     <w:p>
       <w:r>
         <w:pict w14:anchorId="40F9140C">
-          <v:rect id="_x0000_i1894" style="width:0;height:1.5pt" o:hralign="center" o:hrstd="t" o:hr="t" fillcolor="#a0a0a0" stroked="f"/>
+          <v:rect id="_x0000_i1118" style="width:0;height:1.5pt" o:hralign="center" o:hrstd="t" o:hr="t" fillcolor="#a0a0a0" stroked="f"/>
         </w:pict>
       </w:r>
     </w:p>
@@ -9771,7 +9771,7 @@
     <w:p>
       <w:r>
         <w:pict w14:anchorId="2E82DEE3">
-          <v:rect id="_x0000_i1895" style="width:0;height:1.5pt" o:hralign="center" o:hrstd="t" o:hr="t" fillcolor="#a0a0a0" stroked="f"/>
+          <v:rect id="_x0000_i1119" style="width:0;height:1.5pt" o:hralign="center" o:hrstd="t" o:hr="t" fillcolor="#a0a0a0" stroked="f"/>
         </w:pict>
       </w:r>
     </w:p>
@@ -9813,7 +9813,7 @@
     <w:p>
       <w:r>
         <w:pict w14:anchorId="6DAD6BBA">
-          <v:rect id="_x0000_i1896" style="width:0;height:1.5pt" o:hralign="center" o:hrstd="t" o:hr="t" fillcolor="#a0a0a0" stroked="f"/>
+          <v:rect id="_x0000_i1120" style="width:0;height:1.5pt" o:hralign="center" o:hrstd="t" o:hr="t" fillcolor="#a0a0a0" stroked="f"/>
         </w:pict>
       </w:r>
     </w:p>
@@ -10171,7 +10171,7 @@
     <w:p>
       <w:r>
         <w:pict w14:anchorId="310AA06E">
-          <v:rect id="_x0000_i1897" style="width:0;height:1.5pt" o:hralign="center" o:hrstd="t" o:hr="t" fillcolor="#a0a0a0" stroked="f"/>
+          <v:rect id="_x0000_i1121" style="width:0;height:1.5pt" o:hralign="center" o:hrstd="t" o:hr="t" fillcolor="#a0a0a0" stroked="f"/>
         </w:pict>
       </w:r>
     </w:p>
@@ -10444,7 +10444,7 @@
     <w:p>
       <w:r>
         <w:pict w14:anchorId="7FB95820">
-          <v:rect id="_x0000_i1898" style="width:0;height:1.5pt" o:hralign="center" o:hrstd="t" o:hr="t" fillcolor="#a0a0a0" stroked="f"/>
+          <v:rect id="_x0000_i1122" style="width:0;height:1.5pt" o:hralign="center" o:hrstd="t" o:hr="t" fillcolor="#a0a0a0" stroked="f"/>
         </w:pict>
       </w:r>
     </w:p>
@@ -10593,7 +10593,7 @@
     <w:p>
       <w:r>
         <w:pict w14:anchorId="0476BE5D">
-          <v:rect id="_x0000_i1899" style="width:0;height:1.5pt" o:hralign="center" o:hrstd="t" o:hr="t" fillcolor="#a0a0a0" stroked="f"/>
+          <v:rect id="_x0000_i1123" style="width:0;height:1.5pt" o:hralign="center" o:hrstd="t" o:hr="t" fillcolor="#a0a0a0" stroked="f"/>
         </w:pict>
       </w:r>
     </w:p>
@@ -10706,7 +10706,7 @@
     <w:p>
       <w:r>
         <w:pict w14:anchorId="5A719747">
-          <v:rect id="_x0000_i1900" style="width:0;height:1.5pt" o:hralign="center" o:hrstd="t" o:hr="t" fillcolor="#a0a0a0" stroked="f"/>
+          <v:rect id="_x0000_i1124" style="width:0;height:1.5pt" o:hralign="center" o:hrstd="t" o:hr="t" fillcolor="#a0a0a0" stroked="f"/>
         </w:pict>
       </w:r>
     </w:p>
@@ -10733,7 +10733,7 @@
     <w:p>
       <w:r>
         <w:pict w14:anchorId="52C5600D">
-          <v:rect id="_x0000_i1901" style="width:0;height:1.5pt" o:hralign="center" o:hrstd="t" o:hr="t" fillcolor="#a0a0a0" stroked="f"/>
+          <v:rect id="_x0000_i1125" style="width:0;height:1.5pt" o:hralign="center" o:hrstd="t" o:hr="t" fillcolor="#a0a0a0" stroked="f"/>
         </w:pict>
       </w:r>
     </w:p>
@@ -10769,7 +10769,7 @@
       <w:r>
         <w:lastRenderedPageBreak/>
         <w:pict w14:anchorId="7902A3B8">
-          <v:rect id="_x0000_i1902" style="width:0;height:1.5pt" o:hralign="center" o:hrstd="t" o:hr="t" fillcolor="#a0a0a0" stroked="f"/>
+          <v:rect id="_x0000_i1126" style="width:0;height:1.5pt" o:hralign="center" o:hrstd="t" o:hr="t" fillcolor="#a0a0a0" stroked="f"/>
         </w:pict>
       </w:r>
     </w:p>
@@ -10874,7 +10874,7 @@
     <w:p>
       <w:r>
         <w:pict w14:anchorId="754FB13E">
-          <v:rect id="_x0000_i1903" style="width:0;height:1.5pt" o:hralign="center" o:hrstd="t" o:hr="t" fillcolor="#a0a0a0" stroked="f"/>
+          <v:rect id="_x0000_i1127" style="width:0;height:1.5pt" o:hralign="center" o:hrstd="t" o:hr="t" fillcolor="#a0a0a0" stroked="f"/>
         </w:pict>
       </w:r>
     </w:p>
@@ -10961,7 +10961,7 @@
     <w:p>
       <w:r>
         <w:pict w14:anchorId="0D4F8AD7">
-          <v:rect id="_x0000_i1904" style="width:0;height:1.5pt" o:hralign="center" o:hrstd="t" o:hr="t" fillcolor="#a0a0a0" stroked="f"/>
+          <v:rect id="_x0000_i1128" style="width:0;height:1.5pt" o:hralign="center" o:hrstd="t" o:hr="t" fillcolor="#a0a0a0" stroked="f"/>
         </w:pict>
       </w:r>
     </w:p>
@@ -11032,7 +11032,7 @@
     <w:p>
       <w:r>
         <w:pict w14:anchorId="3F8E2290">
-          <v:rect id="_x0000_i1905" style="width:0;height:1.5pt" o:hralign="center" o:hrstd="t" o:hr="t" fillcolor="#a0a0a0" stroked="f"/>
+          <v:rect id="_x0000_i1129" style="width:0;height:1.5pt" o:hralign="center" o:hrstd="t" o:hr="t" fillcolor="#a0a0a0" stroked="f"/>
         </w:pict>
       </w:r>
     </w:p>
@@ -11137,7 +11137,7 @@
     <w:p>
       <w:r>
         <w:pict w14:anchorId="4AD0BA97">
-          <v:rect id="_x0000_i1906" style="width:0;height:1.5pt" o:hralign="center" o:hrstd="t" o:hr="t" fillcolor="#a0a0a0" stroked="f"/>
+          <v:rect id="_x0000_i1130" style="width:0;height:1.5pt" o:hralign="center" o:hrstd="t" o:hr="t" fillcolor="#a0a0a0" stroked="f"/>
         </w:pict>
       </w:r>
     </w:p>
@@ -11339,7 +11339,7 @@
     <w:p>
       <w:r>
         <w:pict w14:anchorId="4493093F">
-          <v:rect id="_x0000_i1907" style="width:0;height:1.5pt" o:hralign="center" o:hrstd="t" o:hr="t" fillcolor="#a0a0a0" stroked="f"/>
+          <v:rect id="_x0000_i1131" style="width:0;height:1.5pt" o:hralign="center" o:hrstd="t" o:hr="t" fillcolor="#a0a0a0" stroked="f"/>
         </w:pict>
       </w:r>
     </w:p>
@@ -11405,7 +11405,7 @@
     <w:p>
       <w:r>
         <w:pict w14:anchorId="57D6A049">
-          <v:rect id="_x0000_i1908" style="width:0;height:1.5pt" o:hralign="center" o:hrstd="t" o:hr="t" fillcolor="#a0a0a0" stroked="f"/>
+          <v:rect id="_x0000_i1132" style="width:0;height:1.5pt" o:hralign="center" o:hrstd="t" o:hr="t" fillcolor="#a0a0a0" stroked="f"/>
         </w:pict>
       </w:r>
     </w:p>
@@ -11450,7 +11450,7 @@
     <w:p>
       <w:r>
         <w:pict w14:anchorId="5FCFE7A9">
-          <v:rect id="_x0000_i1909" style="width:0;height:1.5pt" o:hralign="center" o:hrstd="t" o:hr="t" fillcolor="#a0a0a0" stroked="f"/>
+          <v:rect id="_x0000_i1133" style="width:0;height:1.5pt" o:hralign="center" o:hrstd="t" o:hr="t" fillcolor="#a0a0a0" stroked="f"/>
         </w:pict>
       </w:r>
     </w:p>
@@ -11727,7 +11727,7 @@
     <w:p>
       <w:r>
         <w:pict w14:anchorId="45F721C0">
-          <v:rect id="_x0000_i1910" style="width:0;height:1.5pt" o:hralign="center" o:hrstd="t" o:hr="t" fillcolor="#a0a0a0" stroked="f"/>
+          <v:rect id="_x0000_i1134" style="width:0;height:1.5pt" o:hralign="center" o:hrstd="t" o:hr="t" fillcolor="#a0a0a0" stroked="f"/>
         </w:pict>
       </w:r>
     </w:p>
@@ -11860,7 +11860,7 @@
     <w:p>
       <w:r>
         <w:pict w14:anchorId="34D6970C">
-          <v:rect id="_x0000_i1911" style="width:0;height:1.5pt" o:hralign="center" o:hrstd="t" o:hr="t" fillcolor="#a0a0a0" stroked="f"/>
+          <v:rect id="_x0000_i1135" style="width:0;height:1.5pt" o:hralign="center" o:hrstd="t" o:hr="t" fillcolor="#a0a0a0" stroked="f"/>
         </w:pict>
       </w:r>
     </w:p>
@@ -11913,8 +11913,40 @@
     </w:p>
     <w:p>
       <w:r>
+        <w:t xml:space="preserve">Live </w:t>
+      </w:r>
+      <w:proofErr w:type="gramStart"/>
+      <w:r>
+        <w:t>Link :</w:t>
+      </w:r>
+      <w:proofErr w:type="gramEnd"/>
+    </w:p>
+    <w:p>
+      <w:pPr>
+        <w:rPr>
+          <w:b/>
+          <w:bCs/>
+          <w:sz w:val="24"/>
+          <w:szCs w:val="24"/>
+        </w:rPr>
+      </w:pPr>
+      <w:hyperlink r:id="rId13" w:history="1">
+        <w:r>
+          <w:rPr>
+            <w:rStyle w:val="Hyperlink"/>
+            <w:b/>
+            <w:bCs/>
+            <w:sz w:val="24"/>
+            <w:szCs w:val="24"/>
+          </w:rPr>
+          <w:t>https://cybershield-ai-balaji.vercel.app</w:t>
+        </w:r>
+      </w:hyperlink>
+    </w:p>
+    <w:p>
+      <w:r>
         <w:pict w14:anchorId="276D6819">
-          <v:rect id="_x0000_i1912" style="width:0;height:1.5pt" o:hralign="center" o:hrstd="t" o:hr="t" fillcolor="#a0a0a0" stroked="f"/>
+          <v:rect id="_x0000_i1136" style="width:0;height:1.5pt" o:hralign="center" o:hrstd="t" o:hr="t" fillcolor="#a0a0a0" stroked="f"/>
         </w:pict>
       </w:r>
     </w:p>
@@ -12143,13 +12175,13 @@
     <w:p>
       <w:r>
         <w:pict w14:anchorId="2B3F5E86">
-          <v:rect id="_x0000_i1913" style="width:0;height:1.5pt" o:hralign="center" o:hrstd="t" o:hr="t" fillcolor="#a0a0a0" stroked="f"/>
+          <v:rect id="_x0000_i1137" style="width:0;height:1.5pt" o:hralign="center" o:hrstd="t" o:hr="t" fillcolor="#a0a0a0" stroked="f"/>
         </w:pict>
       </w:r>
     </w:p>
     <w:p/>
     <w:sectPr>
-      <w:headerReference w:type="default" r:id="rId13"/>
+      <w:headerReference w:type="default" r:id="rId14"/>
       <w:pgSz w:w="11906" w:h="16838"/>
       <w:pgMar w:top="1440" w:right="1440" w:bottom="1440" w:left="1440" w:header="720" w:footer="720" w:gutter="0"/>
       <w:pgBorders w:offsetFrom="page">
@@ -27024,6 +27056,7 @@
   <w:style w:type="character" w:default="1" w:styleId="DefaultParagraphFont">
     <w:name w:val="Default Paragraph Font"/>
     <w:uiPriority w:val="1"/>
+    <w:semiHidden/>
     <w:unhideWhenUsed/>
   </w:style>
   <w:style w:type="table" w:default="1" w:styleId="TableNormal">

</xml_diff>